<commit_message>
résumé complete & upgrade forum log
</commit_message>
<xml_diff>
--- a/capture_texte/fiche en cours de remplissage/Fiche_resume_meynadier_renaud.docx
+++ b/capture_texte/fiche en cours de remplissage/Fiche_resume_meynadier_renaud.docx
@@ -1,163 +1,24 @@
 
 <file path=word/document.xml><?xml version="1.0" encoding="utf-8"?>
-<w:document xmlns:wpc="http://schemas.microsoft.com/office/word/2010/wordprocessingCanvas" xmlns:cx="http://schemas.microsoft.com/office/drawing/2014/chartex" xmlns:cx1="http://schemas.microsoft.com/office/drawing/2015/9/8/chartex" xmlns:cx2="http://schemas.microsoft.com/office/drawing/2015/10/21/chartex" xmlns:cx3="http://schemas.microsoft.com/office/drawing/2016/5/9/chartex" xmlns:cx4="http://schemas.microsoft.com/office/drawing/2016/5/10/chartex" xmlns:cx5="http://schemas.microsoft.com/office/drawing/2016/5/11/chartex" xmlns:cx6="http://schemas.microsoft.com/office/drawing/2016/5/12/chartex" xmlns:cx7="http://schemas.microsoft.com/office/drawing/2016/5/13/chartex" xmlns:cx8="http://schemas.microsoft.com/office/drawing/2016/5/14/chartex" xmlns:mc="http://schemas.openxmlformats.org/markup-compatibility/2006" xmlns:aink="http://schemas.microsoft.com/office/drawing/2016/ink" xmlns:am3d="http://schemas.microsoft.com/office/drawing/2017/model3d" xmlns:o="urn:schemas-microsoft-com:office:office" xmlns:r="http://schemas.openxmlformats.org/officeDocument/2006/relationships" xmlns:m="http://schemas.openxmlformats.org/officeDocument/2006/math" xmlns:v="urn:schemas-microsoft-com:vml" xmlns:wp14="http://schemas.microsoft.com/office/word/2010/wordprocessingDrawing" xmlns:wp="http://schemas.openxmlformats.org/drawingml/2006/wordprocessingDrawing" xmlns:w10="urn:schemas-microsoft-com:office:word" xmlns:w="http://schemas.openxmlformats.org/wordprocessingml/2006/main" xmlns:w14="http://schemas.microsoft.com/office/word/2010/wordml" xmlns:w15="http://schemas.microsoft.com/office/word/2012/wordml" xmlns:w16cex="http://schemas.microsoft.com/office/word/2018/wordml/cex" xmlns:w16cid="http://schemas.microsoft.com/office/word/2016/wordml/cid" xmlns:w16="http://schemas.microsoft.com/office/word/2018/wordml" xmlns:w16sdtdh="http://schemas.microsoft.com/office/word/2020/wordml/sdtdatahash" xmlns:w16se="http://schemas.microsoft.com/office/word/2015/wordml/symex" xmlns:wpg="http://schemas.microsoft.com/office/word/2010/wordprocessingGroup" xmlns:wpi="http://schemas.microsoft.com/office/word/2010/wordprocessingInk" xmlns:wne="http://schemas.microsoft.com/office/word/2006/wordml" xmlns:wps="http://schemas.microsoft.com/office/word/2010/wordprocessingShape" mc:Ignorable="w14 w15 w16se w16cid w16 w16cex w16sdtdh wp14">
+<w:document xmlns:o="urn:schemas-microsoft-com:office:office" xmlns:r="http://schemas.openxmlformats.org/officeDocument/2006/relationships" xmlns:v="urn:schemas-microsoft-com:vml" xmlns:w="http://schemas.openxmlformats.org/wordprocessingml/2006/main" xmlns:w10="urn:schemas-microsoft-com:office:word" xmlns:wp="http://schemas.openxmlformats.org/drawingml/2006/wordprocessingDrawing" xmlns:wps="http://schemas.microsoft.com/office/word/2010/wordprocessingShape" xmlns:wpg="http://schemas.microsoft.com/office/word/2010/wordprocessingGroup" xmlns:mc="http://schemas.openxmlformats.org/markup-compatibility/2006" xmlns:wp14="http://schemas.microsoft.com/office/word/2010/wordprocessingDrawing" xmlns:w14="http://schemas.microsoft.com/office/word/2010/wordml" mc:Ignorable="w14 wp14">
   <w:body>
     <w:p>
       <w:pPr>
-        <w:jc w:val="both"/>
-      </w:pPr>
-      <w:r>
-        <w:t xml:space="preserve">Nom : MEYNADIER </w:t>
-      </w:r>
-      <w:r>
-        <w:tab/>
-      </w:r>
-      <w:r>
-        <w:tab/>
-      </w:r>
-      <w:r>
-        <w:tab/>
-      </w:r>
-      <w:r>
-        <w:tab/>
-      </w:r>
-      <w:r>
-        <w:tab/>
-      </w:r>
-      <w:r>
-        <w:tab/>
-      </w:r>
-      <w:r>
-        <w:tab/>
-      </w:r>
-      <w:r>
-        <w:tab/>
-      </w:r>
-      <w:r>
-        <w:tab/>
-      </w:r>
-      <w:r>
-        <w:tab/>
-      </w:r>
-    </w:p>
-    <w:p>
-      <w:pPr>
-        <w:jc w:val="both"/>
-      </w:pPr>
-      <w:r>
-        <w:t>Prénom : Renaud</w:t>
-      </w:r>
-    </w:p>
-    <w:p>
-      <w:r>
-        <w:tab/>
-      </w:r>
-    </w:p>
-    <w:p>
-      <w:r>
-        <w:tab/>
-      </w:r>
-      <w:r>
-        <w:tab/>
-      </w:r>
-      <w:r>
-        <w:tab/>
-      </w:r>
-      <w:r>
-        <w:tab/>
-      </w:r>
-      <w:r>
-        <w:tab/>
-      </w:r>
-      <w:r>
-        <w:tab/>
-      </w:r>
-      <w:r>
-        <w:tab/>
-      </w:r>
-    </w:p>
-    <w:p>
-      <w:pPr>
-        <w:jc w:val="center"/>
-        <w:rPr>
-          <w:b/>
-          <w:bCs/>
-          <w:sz w:val="24"/>
-          <w:szCs w:val="24"/>
-        </w:rPr>
-      </w:pPr>
-      <w:r>
-        <w:rPr>
-          <w:b/>
-          <w:bCs/>
-          <w:sz w:val="24"/>
-          <w:szCs w:val="24"/>
-        </w:rPr>
-        <w:t>Intitulé de la formation : Développeur Web et Web Mobile.</w:t>
-      </w:r>
-    </w:p>
-    <w:p/>
-    <w:p>
-      <w:r>
-        <w:t xml:space="preserve">Description d’entreprise d’accueil </w:t>
-      </w:r>
-    </w:p>
-    <w:p>
-      <w:r>
-        <w:t>Description rapide des missions du stage</w:t>
-      </w:r>
-    </w:p>
-    <w:p>
-      <w:r>
-        <w:t>Si le projet ne couvre pas tout écrire = Le projet de stage ne couvrant pas toutes les compétences du référentiel, j’ai travaillé sur un projet annexe.</w:t>
-      </w:r>
-    </w:p>
-    <w:p>
-      <w:r>
-        <w:t>Description rapide du ou des projets et des technologies utilisées.</w:t>
-      </w:r>
-    </w:p>
-    <w:p>
-      <w:r>
-        <w:t>Almerys c’est quoi ? D’abord pour moi 80 marches à monter. 400 personnes ici.</w:t>
-      </w:r>
-    </w:p>
-    <w:p>
-      <w:r>
-        <w:t>Almerys. Utilise sa propre génération d’énergie, avec des prises de courant spéciales anti-coupure d’électricité.</w:t>
-      </w:r>
-    </w:p>
-    <w:p>
-      <w:r>
-        <w:t>Rien ne doit perturber la connexion internet ou l’alimentation. Les données de serveur de la citadelle sont sauvegardées sur des bobines (type seconde guerre mondiale.</w:t>
-      </w:r>
-    </w:p>
-    <w:p/>
-    <w:p>
-      <w:r>
-        <w:t>Titre : Résumé</w:t>
-      </w:r>
-    </w:p>
-    <w:p/>
-    <w:p/>
-    <w:p/>
-    <w:p/>
-    <w:p/>
-    <w:p/>
-    <w:p/>
-    <w:p>
-      <w:pPr>
-        <w:jc w:val="center"/>
-      </w:pPr>
-      <w:r>
-        <w:rPr>
-          <w:noProof/>
+        <w:pStyle w:val="Normal"/>
+        <w:jc w:val="both"/>
+        <w:rPr>
+          <w:color w:val="000000"/>
+        </w:rPr>
+      </w:pPr>
+      <w:r>
+        <w:rPr>
+          <w:color w:val="000000"/>
         </w:rPr>
         <w:drawing>
-          <wp:inline distT="0" distB="0" distL="0" distR="0" wp14:anchorId="57537153" wp14:editId="25479106">
-            <wp:extent cx="1080572" cy="1366873"/>
-            <wp:effectExtent l="0" t="0" r="5715" b="5080"/>
-            <wp:docPr id="3" name="Image 3" descr="Une image contenant texte&#10;&#10;Description générée automatiquement"/>
+          <wp:inline distT="0" distB="0" distL="0" distR="0">
+            <wp:extent cx="1080770" cy="1367155"/>
+            <wp:effectExtent l="0" t="0" r="0" b="0"/>
+            <wp:docPr id="1" name="Image 3" descr="Une image contenant texte&#10;&#10;Description générée automatiquement"/>
             <wp:cNvGraphicFramePr>
               <a:graphicFrameLocks xmlns:a="http://schemas.openxmlformats.org/drawingml/2006/main" noChangeAspect="1"/>
             </wp:cNvGraphicFramePr>
@@ -165,20 +26,13 @@
               <a:graphicData uri="http://schemas.openxmlformats.org/drawingml/2006/picture">
                 <pic:pic xmlns:pic="http://schemas.openxmlformats.org/drawingml/2006/picture">
                   <pic:nvPicPr>
-                    <pic:cNvPr id="3" name="Image 3" descr="Une image contenant texte&#10;&#10;Description générée automatiquement"/>
+                    <pic:cNvPr id="1" name="Image 3" descr="Une image contenant texte&#10;&#10;Description générée automatiquement"/>
                     <pic:cNvPicPr>
                       <a:picLocks noChangeAspect="1" noChangeArrowheads="1"/>
                     </pic:cNvPicPr>
                   </pic:nvPicPr>
                   <pic:blipFill>
-                    <a:blip r:embed="rId4" cstate="print">
-                      <a:extLst>
-                        <a:ext uri="{28A0092B-C50C-407E-A947-70E740481C1C}">
-                          <a14:useLocalDpi xmlns:a14="http://schemas.microsoft.com/office/drawing/2010/main" val="0"/>
-                        </a:ext>
-                      </a:extLst>
-                    </a:blip>
-                    <a:srcRect/>
+                    <a:blip r:embed="rId2"/>
                     <a:stretch>
                       <a:fillRect/>
                     </a:stretch>
@@ -186,15 +40,11 @@
                   <pic:spPr bwMode="auto">
                     <a:xfrm>
                       <a:off x="0" y="0"/>
-                      <a:ext cx="1121021" cy="1418040"/>
+                      <a:ext cx="1080770" cy="1367155"/>
                     </a:xfrm>
                     <a:prstGeom prst="rect">
                       <a:avLst/>
                     </a:prstGeom>
-                    <a:noFill/>
-                    <a:ln>
-                      <a:noFill/>
-                    </a:ln>
                   </pic:spPr>
                 </pic:pic>
               </a:graphicData>
@@ -204,13 +54,13 @@
       </w:r>
       <w:r>
         <w:rPr>
-          <w:noProof/>
+          <w:color w:val="000000"/>
         </w:rPr>
         <w:drawing>
-          <wp:inline distT="0" distB="0" distL="0" distR="0" wp14:anchorId="07023B10" wp14:editId="070D138C">
-            <wp:extent cx="1200150" cy="853048"/>
-            <wp:effectExtent l="0" t="0" r="0" b="4445"/>
-            <wp:docPr id="6" name="Image 6"/>
+          <wp:inline distT="0" distB="0" distL="0" distR="0">
+            <wp:extent cx="1200150" cy="853440"/>
+            <wp:effectExtent l="0" t="0" r="0" b="0"/>
+            <wp:docPr id="2" name="Image 6" descr=""/>
             <wp:cNvGraphicFramePr>
               <a:graphicFrameLocks xmlns:a="http://schemas.openxmlformats.org/drawingml/2006/main" noChangeAspect="1"/>
             </wp:cNvGraphicFramePr>
@@ -218,20 +68,13 @@
               <a:graphicData uri="http://schemas.openxmlformats.org/drawingml/2006/picture">
                 <pic:pic xmlns:pic="http://schemas.openxmlformats.org/drawingml/2006/picture">
                   <pic:nvPicPr>
-                    <pic:cNvPr id="0" name="Picture 11"/>
+                    <pic:cNvPr id="2" name="Image 6" descr=""/>
                     <pic:cNvPicPr>
                       <a:picLocks noChangeAspect="1" noChangeArrowheads="1"/>
                     </pic:cNvPicPr>
                   </pic:nvPicPr>
                   <pic:blipFill>
-                    <a:blip r:embed="rId5">
-                      <a:extLst>
-                        <a:ext uri="{28A0092B-C50C-407E-A947-70E740481C1C}">
-                          <a14:useLocalDpi xmlns:a14="http://schemas.microsoft.com/office/drawing/2010/main" val="0"/>
-                        </a:ext>
-                      </a:extLst>
-                    </a:blip>
-                    <a:srcRect/>
+                    <a:blip r:embed="rId3"/>
                     <a:stretch>
                       <a:fillRect/>
                     </a:stretch>
@@ -239,15 +82,11 @@
                   <pic:spPr bwMode="auto">
                     <a:xfrm>
                       <a:off x="0" y="0"/>
-                      <a:ext cx="1208414" cy="858922"/>
+                      <a:ext cx="1200150" cy="853440"/>
                     </a:xfrm>
                     <a:prstGeom prst="rect">
                       <a:avLst/>
                     </a:prstGeom>
-                    <a:noFill/>
-                    <a:ln>
-                      <a:noFill/>
-                    </a:ln>
                   </pic:spPr>
                 </pic:pic>
               </a:graphicData>
@@ -257,13 +96,13 @@
       </w:r>
       <w:r>
         <w:rPr>
-          <w:noProof/>
+          <w:color w:val="000000"/>
         </w:rPr>
         <w:drawing>
-          <wp:inline distT="0" distB="0" distL="0" distR="0" wp14:anchorId="483845C3" wp14:editId="62DD4956">
-            <wp:extent cx="871297" cy="726108"/>
+          <wp:inline distT="0" distB="0" distL="0" distR="0">
+            <wp:extent cx="871220" cy="725805"/>
             <wp:effectExtent l="0" t="0" r="0" b="0"/>
-            <wp:docPr id="4" name="Image 4"/>
+            <wp:docPr id="3" name="Image 4" descr=""/>
             <wp:cNvGraphicFramePr>
               <a:graphicFrameLocks xmlns:a="http://schemas.openxmlformats.org/drawingml/2006/main" noChangeAspect="1"/>
             </wp:cNvGraphicFramePr>
@@ -271,20 +110,13 @@
               <a:graphicData uri="http://schemas.openxmlformats.org/drawingml/2006/picture">
                 <pic:pic xmlns:pic="http://schemas.openxmlformats.org/drawingml/2006/picture">
                   <pic:nvPicPr>
-                    <pic:cNvPr id="0" name="Picture 4"/>
+                    <pic:cNvPr id="3" name="Image 4" descr=""/>
                     <pic:cNvPicPr>
                       <a:picLocks noChangeAspect="1" noChangeArrowheads="1"/>
                     </pic:cNvPicPr>
                   </pic:nvPicPr>
                   <pic:blipFill>
-                    <a:blip r:embed="rId6" cstate="print">
-                      <a:extLst>
-                        <a:ext uri="{28A0092B-C50C-407E-A947-70E740481C1C}">
-                          <a14:useLocalDpi xmlns:a14="http://schemas.microsoft.com/office/drawing/2010/main" val="0"/>
-                        </a:ext>
-                      </a:extLst>
-                    </a:blip>
-                    <a:srcRect/>
+                    <a:blip r:embed="rId4"/>
                     <a:stretch>
                       <a:fillRect/>
                     </a:stretch>
@@ -292,15 +124,11 @@
                   <pic:spPr bwMode="auto">
                     <a:xfrm>
                       <a:off x="0" y="0"/>
-                      <a:ext cx="879202" cy="732696"/>
+                      <a:ext cx="871220" cy="725805"/>
                     </a:xfrm>
                     <a:prstGeom prst="rect">
                       <a:avLst/>
                     </a:prstGeom>
-                    <a:noFill/>
-                    <a:ln>
-                      <a:noFill/>
-                    </a:ln>
                   </pic:spPr>
                 </pic:pic>
               </a:graphicData>
@@ -310,13 +138,13 @@
       </w:r>
       <w:r>
         <w:rPr>
-          <w:noProof/>
+          <w:color w:val="000000"/>
         </w:rPr>
         <w:drawing>
-          <wp:inline distT="0" distB="0" distL="0" distR="0" wp14:anchorId="03C2366F" wp14:editId="4CAEEE2E">
-            <wp:extent cx="1128395" cy="791071"/>
-            <wp:effectExtent l="0" t="0" r="0" b="9525"/>
-            <wp:docPr id="2" name="Image 2"/>
+          <wp:inline distT="0" distB="0" distL="0" distR="0">
+            <wp:extent cx="1128395" cy="791210"/>
+            <wp:effectExtent l="0" t="0" r="0" b="0"/>
+            <wp:docPr id="4" name="Image 2" descr=""/>
             <wp:cNvGraphicFramePr>
               <a:graphicFrameLocks xmlns:a="http://schemas.openxmlformats.org/drawingml/2006/main" noChangeAspect="1"/>
             </wp:cNvGraphicFramePr>
@@ -324,20 +152,13 @@
               <a:graphicData uri="http://schemas.openxmlformats.org/drawingml/2006/picture">
                 <pic:pic xmlns:pic="http://schemas.openxmlformats.org/drawingml/2006/picture">
                   <pic:nvPicPr>
-                    <pic:cNvPr id="0" name="Picture 2"/>
+                    <pic:cNvPr id="4" name="Image 2" descr=""/>
                     <pic:cNvPicPr>
                       <a:picLocks noChangeAspect="1" noChangeArrowheads="1"/>
                     </pic:cNvPicPr>
                   </pic:nvPicPr>
                   <pic:blipFill>
-                    <a:blip r:embed="rId7" cstate="print">
-                      <a:extLst>
-                        <a:ext uri="{28A0092B-C50C-407E-A947-70E740481C1C}">
-                          <a14:useLocalDpi xmlns:a14="http://schemas.microsoft.com/office/drawing/2010/main" val="0"/>
-                        </a:ext>
-                      </a:extLst>
-                    </a:blip>
-                    <a:srcRect/>
+                    <a:blip r:embed="rId5"/>
                     <a:stretch>
                       <a:fillRect/>
                     </a:stretch>
@@ -345,15 +166,11 @@
                   <pic:spPr bwMode="auto">
                     <a:xfrm>
                       <a:off x="0" y="0"/>
-                      <a:ext cx="1139534" cy="798880"/>
+                      <a:ext cx="1128395" cy="791210"/>
                     </a:xfrm>
                     <a:prstGeom prst="rect">
                       <a:avLst/>
                     </a:prstGeom>
-                    <a:noFill/>
-                    <a:ln>
-                      <a:noFill/>
-                    </a:ln>
                   </pic:spPr>
                 </pic:pic>
               </a:graphicData>
@@ -363,13 +180,13 @@
       </w:r>
       <w:r>
         <w:rPr>
-          <w:noProof/>
+          <w:color w:val="000000"/>
         </w:rPr>
         <w:drawing>
-          <wp:inline distT="0" distB="0" distL="0" distR="0" wp14:anchorId="2DA4E5E5" wp14:editId="06F40219">
-            <wp:extent cx="1366200" cy="249065"/>
-            <wp:effectExtent l="0" t="0" r="5715" b="0"/>
-            <wp:docPr id="1" name="Image 1"/>
+          <wp:inline distT="0" distB="0" distL="0" distR="0">
+            <wp:extent cx="1365885" cy="248920"/>
+            <wp:effectExtent l="0" t="0" r="0" b="0"/>
+            <wp:docPr id="5" name="Image 1" descr=""/>
             <wp:cNvGraphicFramePr>
               <a:graphicFrameLocks xmlns:a="http://schemas.openxmlformats.org/drawingml/2006/main" noChangeAspect="1"/>
             </wp:cNvGraphicFramePr>
@@ -377,20 +194,13 @@
               <a:graphicData uri="http://schemas.openxmlformats.org/drawingml/2006/picture">
                 <pic:pic xmlns:pic="http://schemas.openxmlformats.org/drawingml/2006/picture">
                   <pic:nvPicPr>
-                    <pic:cNvPr id="0" name="Picture 1"/>
+                    <pic:cNvPr id="5" name="Image 1" descr=""/>
                     <pic:cNvPicPr>
                       <a:picLocks noChangeAspect="1" noChangeArrowheads="1"/>
                     </pic:cNvPicPr>
                   </pic:nvPicPr>
                   <pic:blipFill>
-                    <a:blip r:embed="rId8" cstate="print">
-                      <a:extLst>
-                        <a:ext uri="{28A0092B-C50C-407E-A947-70E740481C1C}">
-                          <a14:useLocalDpi xmlns:a14="http://schemas.microsoft.com/office/drawing/2010/main" val="0"/>
-                        </a:ext>
-                      </a:extLst>
-                    </a:blip>
-                    <a:srcRect/>
+                    <a:blip r:embed="rId6"/>
                     <a:stretch>
                       <a:fillRect/>
                     </a:stretch>
@@ -398,15 +208,11 @@
                   <pic:spPr bwMode="auto">
                     <a:xfrm>
                       <a:off x="0" y="0"/>
-                      <a:ext cx="1398149" cy="254889"/>
+                      <a:ext cx="1365885" cy="248920"/>
                     </a:xfrm>
                     <a:prstGeom prst="rect">
                       <a:avLst/>
                     </a:prstGeom>
-                    <a:noFill/>
-                    <a:ln>
-                      <a:noFill/>
-                    </a:ln>
                   </pic:spPr>
                 </pic:pic>
               </a:graphicData>
@@ -415,22 +221,440 @@
         </w:drawing>
       </w:r>
     </w:p>
+    <w:p>
+      <w:pPr>
+        <w:pStyle w:val="Normal"/>
+        <w:jc w:val="both"/>
+        <w:rPr>
+          <w:color w:val="000000"/>
+        </w:rPr>
+      </w:pPr>
+      <w:r>
+        <w:rPr>
+          <w:color w:val="000000"/>
+        </w:rPr>
+        <w:t>MEYNADIER  Renaud</w:t>
+      </w:r>
+    </w:p>
+    <w:p>
+      <w:pPr>
+        <w:pStyle w:val="Normal"/>
+        <w:jc w:val="both"/>
+        <w:rPr>
+          <w:color w:val="000000"/>
+        </w:rPr>
+      </w:pPr>
+      <w:r>
+        <w:rPr>
+          <w:b/>
+          <w:bCs/>
+          <w:color w:val="000000"/>
+          <w:sz w:val="24"/>
+          <w:szCs w:val="24"/>
+        </w:rPr>
+        <w:t>Développeur Web et Web Mobile.</w:t>
+      </w:r>
+    </w:p>
+    <w:p>
+      <w:pPr>
+        <w:pStyle w:val="Normal"/>
+        <w:jc w:val="both"/>
+        <w:rPr>
+          <w:color w:val="000000"/>
+        </w:rPr>
+      </w:pPr>
+      <w:r>
+        <w:rPr>
+          <w:color w:val="000000"/>
+        </w:rPr>
+        <w:tab/>
+        <w:tab/>
+        <w:tab/>
+        <w:tab/>
+        <w:tab/>
+        <w:tab/>
+        <w:tab/>
+      </w:r>
+    </w:p>
+    <w:p>
+      <w:pPr>
+        <w:pStyle w:val="Normal"/>
+        <w:jc w:val="both"/>
+        <w:rPr>
+          <w:color w:val="000000"/>
+        </w:rPr>
+      </w:pPr>
+      <w:r>
+        <w:rPr>
+          <w:color w:val="000000"/>
+        </w:rPr>
+        <w:t>Titre : Résumé</w:t>
+      </w:r>
+      <w:r>
+        <w:rPr>
+          <w:color w:val="000000"/>
+        </w:rPr>
+        <w:t xml:space="preserve"> </w:t>
+      </w:r>
+    </w:p>
+    <w:p>
+      <w:pPr>
+        <w:pStyle w:val="Normal"/>
+        <w:jc w:val="both"/>
+        <w:rPr>
+          <w:color w:val="000000"/>
+        </w:rPr>
+      </w:pPr>
+      <w:r>
+        <w:rPr>
+          <w:color w:val="000000"/>
+        </w:rPr>
+        <w:t>Be-</w:t>
+      </w:r>
+      <w:r>
+        <w:rPr>
+          <w:color w:val="000000"/>
+        </w:rPr>
+        <w:t>Almerys, c</w:t>
+      </w:r>
+      <w:r>
+        <w:rPr>
+          <w:color w:val="000000"/>
+        </w:rPr>
+        <w:t xml:space="preserve">’est une entité </w:t>
+      </w:r>
+      <w:r>
+        <w:rPr>
+          <w:color w:val="000000"/>
+        </w:rPr>
+        <w:t>de plus de 2000 collaborateurs dont 400 en France,</w:t>
+      </w:r>
+      <w:r>
+        <w:rPr>
+          <w:color w:val="000000"/>
+        </w:rPr>
+        <w:t xml:space="preserve"> qui propose des solutions et services pour le traitement de donnée, gestion de conformité, distribution de produits, délégation de gestion et la mise en œuvre des service différenciant. C’est un expert de haute technologie appliqué à l’assurance et à la santé.</w:t>
+      </w:r>
+    </w:p>
+    <w:p>
+      <w:pPr>
+        <w:pStyle w:val="Normal"/>
+        <w:jc w:val="both"/>
+        <w:rPr>
+          <w:color w:val="000000"/>
+        </w:rPr>
+      </w:pPr>
+      <w:r>
+        <w:rPr>
+          <w:color w:val="000000"/>
+        </w:rPr>
+        <w:t>Avec</w:t>
+      </w:r>
+      <w:r>
+        <w:rPr>
+          <w:color w:val="000000"/>
+        </w:rPr>
+        <w:t xml:space="preserve"> </w:t>
+      </w:r>
+      <w:r>
+        <w:rPr>
+          <w:color w:val="000000"/>
+        </w:rPr>
+        <w:t>ses</w:t>
+      </w:r>
+      <w:r>
+        <w:rPr>
+          <w:color w:val="000000"/>
+        </w:rPr>
+        <w:t xml:space="preserve"> sous-entités :</w:t>
+      </w:r>
+    </w:p>
+    <w:p>
+      <w:pPr>
+        <w:pStyle w:val="Normal"/>
+        <w:jc w:val="both"/>
+        <w:rPr/>
+      </w:pPr>
+      <w:r>
+        <w:rPr>
+          <w:color w:val="000000"/>
+        </w:rPr>
+        <w:t xml:space="preserve">Beys Trusted Solutions, Beys Pay, Beys </w:t>
+      </w:r>
+      <w:r>
+        <w:rPr>
+          <w:color w:val="000000"/>
+        </w:rPr>
+        <w:t>Health</w:t>
+      </w:r>
+      <w:r>
+        <w:rPr>
+          <w:color w:val="000000"/>
+        </w:rPr>
+        <w:t xml:space="preserve"> </w:t>
+      </w:r>
+      <w:r>
+        <w:rPr>
+          <w:color w:val="000000"/>
+        </w:rPr>
+        <w:t>Solutions</w:t>
+      </w:r>
+      <w:r>
+        <w:rPr>
+          <w:color w:val="000000"/>
+        </w:rPr>
+        <w:t xml:space="preserve">, Beys </w:t>
+      </w:r>
+      <w:r>
+        <w:rPr>
+          <w:color w:val="000000"/>
+        </w:rPr>
+        <w:t>Search</w:t>
+      </w:r>
+      <w:r>
+        <w:rPr>
+          <w:color w:val="000000"/>
+        </w:rPr>
+        <w:t xml:space="preserve">, Beys </w:t>
+      </w:r>
+      <w:r>
+        <w:rPr>
+          <w:color w:val="000000"/>
+        </w:rPr>
+        <w:t>Software</w:t>
+      </w:r>
+      <w:r>
+        <w:rPr>
+          <w:color w:val="000000"/>
+        </w:rPr>
+        <w:t xml:space="preserve"> et la Citadelle.</w:t>
+      </w:r>
+    </w:p>
+    <w:p>
+      <w:pPr>
+        <w:pStyle w:val="Normal"/>
+        <w:jc w:val="both"/>
+        <w:rPr/>
+      </w:pPr>
+      <w:r>
+        <w:rPr/>
+        <w:t xml:space="preserve">Sécuriser le bien le plus précieux de l’entreprise : ses données. </w:t>
+      </w:r>
+    </w:p>
+    <w:p>
+      <w:pPr>
+        <w:pStyle w:val="Normal"/>
+        <w:jc w:val="both"/>
+        <w:rPr/>
+      </w:pPr>
+      <w:r>
+        <w:rPr/>
+        <w:t>Digitaliser les processus métiers de l’entreprise pour lui permettre de réduire ses coûts et d’améliorer ses ventes.</w:t>
+      </w:r>
+    </w:p>
+    <w:p>
+      <w:pPr>
+        <w:pStyle w:val="Normal"/>
+        <w:jc w:val="both"/>
+        <w:rPr/>
+      </w:pPr>
+      <w:r>
+        <w:rPr/>
+        <w:t xml:space="preserve">Sécuriser juridiquement le client lors des prises d’engagement. </w:t>
+      </w:r>
+    </w:p>
+    <w:p>
+      <w:pPr>
+        <w:pStyle w:val="Normal"/>
+        <w:jc w:val="both"/>
+        <w:rPr/>
+      </w:pPr>
+      <w:r>
+        <w:rPr/>
+        <w:t xml:space="preserve">Réduire et sécuriser les coûts d’archivage et de transfert de documents. </w:t>
+      </w:r>
+    </w:p>
+    <w:p>
+      <w:pPr>
+        <w:pStyle w:val="Normal"/>
+        <w:jc w:val="both"/>
+        <w:rPr>
+          <w:color w:val="000000"/>
+        </w:rPr>
+      </w:pPr>
+      <w:r>
+        <w:rPr>
+          <w:color w:val="000000"/>
+        </w:rPr>
+        <w:t>Ils ont différents clients : La Banque Postale (assurance), Generali, Mutuelle Générale, Swisslife…</w:t>
+      </w:r>
+    </w:p>
+    <w:p>
+      <w:pPr>
+        <w:pStyle w:val="Normal"/>
+        <w:jc w:val="both"/>
+        <w:rPr>
+          <w:color w:val="000000"/>
+        </w:rPr>
+      </w:pPr>
+      <w:r>
+        <w:rPr>
+          <w:color w:val="000000"/>
+        </w:rPr>
+      </w:r>
+    </w:p>
+    <w:p>
+      <w:pPr>
+        <w:pStyle w:val="Normal"/>
+        <w:jc w:val="both"/>
+        <w:rPr>
+          <w:color w:val="000000"/>
+        </w:rPr>
+      </w:pPr>
+      <w:r>
+        <w:rPr>
+          <w:color w:val="000000"/>
+        </w:rPr>
+        <w:t>J’ai donc fait un stage au sein de Be-Ys Software France, Clermont-Ferrand.</w:t>
+      </w:r>
+    </w:p>
+    <w:p>
+      <w:pPr>
+        <w:pStyle w:val="Normal"/>
+        <w:jc w:val="both"/>
+        <w:rPr>
+          <w:color w:val="000000"/>
+        </w:rPr>
+      </w:pPr>
+      <w:r>
+        <w:rPr>
+          <w:color w:val="000000"/>
+        </w:rPr>
+        <w:t xml:space="preserve">Ils sont présent </w:t>
+      </w:r>
+      <w:r>
+        <w:rPr>
+          <w:color w:val="000000"/>
+        </w:rPr>
+        <w:t>aussi</w:t>
+      </w:r>
+      <w:r>
+        <w:rPr>
+          <w:color w:val="000000"/>
+        </w:rPr>
+        <w:t xml:space="preserve"> à Paris, Toulouse, Annecy, au Luxembourg et à Tunis. </w:t>
+      </w:r>
+    </w:p>
+    <w:p>
+      <w:pPr>
+        <w:pStyle w:val="Normal"/>
+        <w:jc w:val="both"/>
+        <w:rPr>
+          <w:color w:val="000000"/>
+        </w:rPr>
+      </w:pPr>
+      <w:r>
+        <w:rPr>
+          <w:color w:val="000000"/>
+        </w:rPr>
+        <w:t xml:space="preserve">J’ai intégré l’équipe ‘’front’’, nous faisons en ce moment une application Angular </w:t>
+      </w:r>
+      <w:r>
+        <w:rPr>
+          <w:color w:val="000000"/>
+        </w:rPr>
+        <w:t>IAM-FRONT</w:t>
+      </w:r>
+      <w:r>
+        <w:rPr>
+          <w:color w:val="000000"/>
+        </w:rPr>
+        <w:t xml:space="preserve">, qui permet la gestion de rôle, de donnée pour les professionnel de la santé. En ce moment l’application est refondue en version 2.0. Les tâches sont divisées en plusieurs Sprint de trois semaines, qui sont eux même divisé en plusieurs tickets. J’ai eu la chance de pouvoir prendre quelques tickets front, des correctifs de modal. De la correction de CSS, </w:t>
+      </w:r>
+      <w:r>
+        <w:rPr>
+          <w:color w:val="000000"/>
+        </w:rPr>
+        <w:t>utilisation de leur librairie Angular</w:t>
+      </w:r>
+      <w:r>
+        <w:rPr>
+          <w:color w:val="000000"/>
+        </w:rPr>
+        <w:t xml:space="preserve">. Corriger quelques problèmes de traduction, rendre l’interface plus intuitive et facile d’accès. </w:t>
+      </w:r>
+      <w:r>
+        <w:rPr>
+          <w:color w:val="000000"/>
+        </w:rPr>
+        <w:t>Nous avons recours aussi à des appels d’API, et des dashboard pour gérer les comptes et identifiants.</w:t>
+      </w:r>
+    </w:p>
+    <w:p>
+      <w:pPr>
+        <w:pStyle w:val="Normal"/>
+        <w:jc w:val="both"/>
+        <w:rPr>
+          <w:color w:val="000000"/>
+        </w:rPr>
+      </w:pPr>
+      <w:r>
+        <w:rPr>
+          <w:color w:val="000000"/>
+        </w:rPr>
+        <w:t xml:space="preserve">Après mes tickets sont analysés (pipeline gitlab), traités et validé (avec Jira) si ils ont passé une première série de test. On utilise MatterMost, Skype Entreprise et Outlook qui vont nous permettre de faire des retours très rapide. </w:t>
+      </w:r>
+    </w:p>
+    <w:p>
+      <w:pPr>
+        <w:pStyle w:val="Normal"/>
+        <w:jc w:val="both"/>
+        <w:rPr>
+          <w:color w:val="000000"/>
+        </w:rPr>
+      </w:pPr>
+      <w:r>
+        <w:rPr>
+          <w:color w:val="000000"/>
+        </w:rPr>
+        <w:t>Le stage étant que Front, j’ai un projet annexe pour le coté ‘’back’’, comme mon fil rouge, un site marchand conçu de A à Z.</w:t>
+      </w:r>
+    </w:p>
+    <w:p>
+      <w:pPr>
+        <w:pStyle w:val="Normal"/>
+        <w:spacing w:before="0" w:after="160"/>
+        <w:jc w:val="both"/>
+        <w:rPr>
+          <w:color w:val="000000"/>
+        </w:rPr>
+      </w:pPr>
+      <w:r>
+        <w:rPr>
+          <w:color w:val="000000"/>
+        </w:rPr>
+        <w:t>Pour le stage c’est Angular/TypeScript comme technologie principale. Pour le projet fil rouge, c’est un peu tout, mais surtout Symfony/Php.</w:t>
+      </w:r>
+    </w:p>
     <w:sectPr>
+      <w:type w:val="nextPage"/>
       <w:pgSz w:w="11906" w:h="16838"/>
-      <w:pgMar w:top="720" w:right="720" w:bottom="720" w:left="720" w:header="708" w:footer="708" w:gutter="0"/>
-      <w:cols w:space="708"/>
-      <w:docGrid w:linePitch="360"/>
+      <w:pgMar w:left="720" w:right="720" w:gutter="0" w:header="0" w:top="720" w:footer="0" w:bottom="720"/>
+      <w:pgNumType w:fmt="decimal"/>
+      <w:formProt w:val="false"/>
+      <w:textDirection w:val="lrTb"/>
+      <w:docGrid w:type="default" w:linePitch="360" w:charSpace="4096"/>
     </w:sectPr>
   </w:body>
 </w:document>
 </file>
 
 <file path=word/styles.xml><?xml version="1.0" encoding="utf-8"?>
-<w:styles xmlns:mc="http://schemas.openxmlformats.org/markup-compatibility/2006" xmlns:r="http://schemas.openxmlformats.org/officeDocument/2006/relationships" xmlns:w="http://schemas.openxmlformats.org/wordprocessingml/2006/main" xmlns:w14="http://schemas.microsoft.com/office/word/2010/wordml" xmlns:w15="http://schemas.microsoft.com/office/word/2012/wordml" xmlns:w16cex="http://schemas.microsoft.com/office/word/2018/wordml/cex" xmlns:w16cid="http://schemas.microsoft.com/office/word/2016/wordml/cid" xmlns:w16="http://schemas.microsoft.com/office/word/2018/wordml" xmlns:w16sdtdh="http://schemas.microsoft.com/office/word/2020/wordml/sdtdatahash" xmlns:w16se="http://schemas.microsoft.com/office/word/2015/wordml/symex" mc:Ignorable="w14 w15 w16se w16cid w16 w16cex w16sdtdh">
+<w:styles xmlns:w="http://schemas.openxmlformats.org/wordprocessingml/2006/main" xmlns:w14="http://schemas.microsoft.com/office/word/2010/wordml" xmlns:mc="http://schemas.openxmlformats.org/markup-compatibility/2006" mc:Ignorable="w14">
   <w:docDefaults>
     <w:rPrDefault>
       <w:rPr>
-        <w:rFonts w:asciiTheme="minorHAnsi" w:eastAsiaTheme="minorHAnsi" w:hAnsiTheme="minorHAnsi" w:cstheme="minorBidi"/>
+        <w:rFonts w:ascii="Calibri" w:hAnsi="Calibri" w:eastAsia="Calibri" w:cs="" w:asciiTheme="minorHAnsi" w:cstheme="minorBidi" w:eastAsiaTheme="minorHAnsi" w:hAnsiTheme="minorHAnsi"/>
         <w:sz w:val="22"/>
         <w:szCs w:val="22"/>
         <w:lang w:val="fr-FR" w:eastAsia="en-US" w:bidi="ar-SA"/>
@@ -438,21 +662,21 @@
     </w:rPrDefault>
     <w:pPrDefault>
       <w:pPr>
-        <w:spacing w:after="160" w:line="259" w:lineRule="auto"/>
+        <w:suppressAutoHyphens w:val="true"/>
       </w:pPr>
     </w:pPrDefault>
   </w:docDefaults>
   <w:latentStyles w:defLockedState="0" w:defUIPriority="99" w:defSemiHidden="0" w:defUnhideWhenUsed="0" w:defQFormat="0" w:count="376">
     <w:lsdException w:name="Normal" w:uiPriority="0" w:qFormat="1"/>
     <w:lsdException w:name="heading 1" w:uiPriority="9" w:qFormat="1"/>
-    <w:lsdException w:name="heading 2" w:semiHidden="1" w:uiPriority="9" w:unhideWhenUsed="1" w:qFormat="1"/>
-    <w:lsdException w:name="heading 3" w:semiHidden="1" w:uiPriority="9" w:unhideWhenUsed="1" w:qFormat="1"/>
-    <w:lsdException w:name="heading 4" w:semiHidden="1" w:uiPriority="9" w:unhideWhenUsed="1" w:qFormat="1"/>
-    <w:lsdException w:name="heading 5" w:semiHidden="1" w:uiPriority="9" w:unhideWhenUsed="1" w:qFormat="1"/>
-    <w:lsdException w:name="heading 6" w:semiHidden="1" w:uiPriority="9" w:unhideWhenUsed="1" w:qFormat="1"/>
-    <w:lsdException w:name="heading 7" w:semiHidden="1" w:uiPriority="9" w:unhideWhenUsed="1" w:qFormat="1"/>
-    <w:lsdException w:name="heading 8" w:semiHidden="1" w:uiPriority="9" w:unhideWhenUsed="1" w:qFormat="1"/>
-    <w:lsdException w:name="heading 9" w:semiHidden="1" w:uiPriority="9" w:unhideWhenUsed="1" w:qFormat="1"/>
+    <w:lsdException w:name="heading 2" w:uiPriority="9" w:semiHidden="1" w:unhideWhenUsed="1" w:qFormat="1"/>
+    <w:lsdException w:name="heading 3" w:uiPriority="9" w:semiHidden="1" w:unhideWhenUsed="1" w:qFormat="1"/>
+    <w:lsdException w:name="heading 4" w:uiPriority="9" w:semiHidden="1" w:unhideWhenUsed="1" w:qFormat="1"/>
+    <w:lsdException w:name="heading 5" w:uiPriority="9" w:semiHidden="1" w:unhideWhenUsed="1" w:qFormat="1"/>
+    <w:lsdException w:name="heading 6" w:uiPriority="9" w:semiHidden="1" w:unhideWhenUsed="1" w:qFormat="1"/>
+    <w:lsdException w:name="heading 7" w:uiPriority="9" w:semiHidden="1" w:unhideWhenUsed="1" w:qFormat="1"/>
+    <w:lsdException w:name="heading 8" w:uiPriority="9" w:semiHidden="1" w:unhideWhenUsed="1" w:qFormat="1"/>
+    <w:lsdException w:name="heading 9" w:uiPriority="9" w:semiHidden="1" w:unhideWhenUsed="1" w:qFormat="1"/>
     <w:lsdException w:name="index 1" w:semiHidden="1" w:unhideWhenUsed="1"/>
     <w:lsdException w:name="index 2" w:semiHidden="1" w:unhideWhenUsed="1"/>
     <w:lsdException w:name="index 3" w:semiHidden="1" w:unhideWhenUsed="1"/>
@@ -462,22 +686,22 @@
     <w:lsdException w:name="index 7" w:semiHidden="1" w:unhideWhenUsed="1"/>
     <w:lsdException w:name="index 8" w:semiHidden="1" w:unhideWhenUsed="1"/>
     <w:lsdException w:name="index 9" w:semiHidden="1" w:unhideWhenUsed="1"/>
-    <w:lsdException w:name="toc 1" w:semiHidden="1" w:uiPriority="39" w:unhideWhenUsed="1"/>
-    <w:lsdException w:name="toc 2" w:semiHidden="1" w:uiPriority="39" w:unhideWhenUsed="1"/>
-    <w:lsdException w:name="toc 3" w:semiHidden="1" w:uiPriority="39" w:unhideWhenUsed="1"/>
-    <w:lsdException w:name="toc 4" w:semiHidden="1" w:uiPriority="39" w:unhideWhenUsed="1"/>
-    <w:lsdException w:name="toc 5" w:semiHidden="1" w:uiPriority="39" w:unhideWhenUsed="1"/>
-    <w:lsdException w:name="toc 6" w:semiHidden="1" w:uiPriority="39" w:unhideWhenUsed="1"/>
-    <w:lsdException w:name="toc 7" w:semiHidden="1" w:uiPriority="39" w:unhideWhenUsed="1"/>
-    <w:lsdException w:name="toc 8" w:semiHidden="1" w:uiPriority="39" w:unhideWhenUsed="1"/>
-    <w:lsdException w:name="toc 9" w:semiHidden="1" w:uiPriority="39" w:unhideWhenUsed="1"/>
+    <w:lsdException w:name="toc 1" w:uiPriority="39" w:semiHidden="1" w:unhideWhenUsed="1"/>
+    <w:lsdException w:name="toc 2" w:uiPriority="39" w:semiHidden="1" w:unhideWhenUsed="1"/>
+    <w:lsdException w:name="toc 3" w:uiPriority="39" w:semiHidden="1" w:unhideWhenUsed="1"/>
+    <w:lsdException w:name="toc 4" w:uiPriority="39" w:semiHidden="1" w:unhideWhenUsed="1"/>
+    <w:lsdException w:name="toc 5" w:uiPriority="39" w:semiHidden="1" w:unhideWhenUsed="1"/>
+    <w:lsdException w:name="toc 6" w:uiPriority="39" w:semiHidden="1" w:unhideWhenUsed="1"/>
+    <w:lsdException w:name="toc 7" w:uiPriority="39" w:semiHidden="1" w:unhideWhenUsed="1"/>
+    <w:lsdException w:name="toc 8" w:uiPriority="39" w:semiHidden="1" w:unhideWhenUsed="1"/>
+    <w:lsdException w:name="toc 9" w:uiPriority="39" w:semiHidden="1" w:unhideWhenUsed="1"/>
     <w:lsdException w:name="Normal Indent" w:semiHidden="1" w:unhideWhenUsed="1"/>
     <w:lsdException w:name="footnote text" w:semiHidden="1" w:unhideWhenUsed="1"/>
     <w:lsdException w:name="annotation text" w:semiHidden="1" w:unhideWhenUsed="1"/>
     <w:lsdException w:name="header" w:semiHidden="1" w:unhideWhenUsed="1"/>
     <w:lsdException w:name="footer" w:semiHidden="1" w:unhideWhenUsed="1"/>
     <w:lsdException w:name="index heading" w:semiHidden="1" w:unhideWhenUsed="1"/>
-    <w:lsdException w:name="caption" w:semiHidden="1" w:uiPriority="35" w:unhideWhenUsed="1" w:qFormat="1"/>
+    <w:lsdException w:name="caption" w:uiPriority="35" w:semiHidden="1" w:unhideWhenUsed="1" w:qFormat="1"/>
     <w:lsdException w:name="table of figures" w:semiHidden="1" w:unhideWhenUsed="1"/>
     <w:lsdException w:name="envelope address" w:semiHidden="1" w:unhideWhenUsed="1"/>
     <w:lsdException w:name="envelope return" w:semiHidden="1" w:unhideWhenUsed="1"/>
@@ -508,7 +732,7 @@
     <w:lsdException w:name="Title" w:uiPriority="10" w:qFormat="1"/>
     <w:lsdException w:name="Closing" w:semiHidden="1" w:unhideWhenUsed="1"/>
     <w:lsdException w:name="Signature" w:semiHidden="1" w:unhideWhenUsed="1"/>
-    <w:lsdException w:name="Default Paragraph Font" w:semiHidden="1" w:uiPriority="1" w:unhideWhenUsed="1"/>
+    <w:lsdException w:name="Default Paragraph Font" w:uiPriority="1" w:semiHidden="1" w:unhideWhenUsed="1"/>
     <w:lsdException w:name="Body Text" w:semiHidden="1" w:unhideWhenUsed="1"/>
     <w:lsdException w:name="Body Text Indent" w:semiHidden="1" w:unhideWhenUsed="1"/>
     <w:lsdException w:name="List Continue" w:semiHidden="1" w:unhideWhenUsed="1"/>
@@ -708,8 +932,8 @@
     <w:lsdException w:name="Subtle Reference" w:uiPriority="31" w:qFormat="1"/>
     <w:lsdException w:name="Intense Reference" w:uiPriority="32" w:qFormat="1"/>
     <w:lsdException w:name="Book Title" w:uiPriority="33" w:qFormat="1"/>
-    <w:lsdException w:name="Bibliography" w:semiHidden="1" w:uiPriority="37" w:unhideWhenUsed="1"/>
-    <w:lsdException w:name="TOC Heading" w:semiHidden="1" w:uiPriority="39" w:unhideWhenUsed="1" w:qFormat="1"/>
+    <w:lsdException w:name="Bibliography" w:uiPriority="37" w:semiHidden="1" w:unhideWhenUsed="1"/>
+    <w:lsdException w:name="TOC Heading" w:uiPriority="39" w:semiHidden="1" w:unhideWhenUsed="1" w:qFormat="1"/>
     <w:lsdException w:name="Plain Table 1" w:uiPriority="41"/>
     <w:lsdException w:name="Plain Table 2" w:uiPriority="42"/>
     <w:lsdException w:name="Plain Table 3" w:uiPriority="43"/>
@@ -820,15 +1044,122 @@
     <w:lsdException w:name="Unresolved Mention" w:semiHidden="1" w:unhideWhenUsed="1"/>
     <w:lsdException w:name="Smart Link" w:semiHidden="1" w:unhideWhenUsed="1"/>
   </w:latentStyles>
-  <w:style w:type="paragraph" w:default="1" w:styleId="Normal">
+  <w:style w:type="paragraph" w:styleId="Normal" w:default="1">
     <w:name w:val="Normal"/>
     <w:qFormat/>
+    <w:pPr>
+      <w:widowControl/>
+      <w:bidi w:val="0"/>
+      <w:spacing w:lineRule="auto" w:line="259" w:before="0" w:after="160"/>
+      <w:jc w:val="left"/>
+    </w:pPr>
+    <w:rPr>
+      <w:rFonts w:ascii="Calibri" w:hAnsi="Calibri" w:eastAsia="Calibri" w:cs="" w:asciiTheme="minorHAnsi" w:cstheme="minorBidi" w:eastAsiaTheme="minorHAnsi" w:hAnsiTheme="minorHAnsi"/>
+      <w:color w:val="auto"/>
+      <w:kern w:val="0"/>
+      <w:sz w:val="22"/>
+      <w:szCs w:val="22"/>
+      <w:lang w:val="fr-FR" w:eastAsia="en-US" w:bidi="ar-SA"/>
+    </w:rPr>
   </w:style>
-  <w:style w:type="character" w:default="1" w:styleId="Policepardfaut">
+  <w:style w:type="paragraph" w:styleId="Titre1">
+    <w:name w:val="Heading 1"/>
+    <w:basedOn w:val="Titre"/>
+    <w:next w:val="Corpsdetexte"/>
+    <w:qFormat/>
+    <w:pPr>
+      <w:spacing w:before="240" w:after="120"/>
+      <w:outlineLvl w:val="0"/>
+    </w:pPr>
+    <w:rPr>
+      <w:rFonts w:ascii="Liberation Serif" w:hAnsi="Liberation Serif" w:eastAsia="Segoe UI" w:cs="Tahoma"/>
+      <w:b/>
+      <w:bCs/>
+      <w:sz w:val="48"/>
+      <w:szCs w:val="48"/>
+    </w:rPr>
+  </w:style>
+  <w:style w:type="character" w:styleId="DefaultParagraphFont" w:default="1">
     <w:name w:val="Default Paragraph Font"/>
     <w:uiPriority w:val="1"/>
     <w:semiHidden/>
     <w:unhideWhenUsed/>
+    <w:qFormat/>
+    <w:rPr/>
+  </w:style>
+  <w:style w:type="character" w:styleId="Accentuationforte">
+    <w:name w:val="Accentuation forte"/>
+    <w:qFormat/>
+    <w:rPr>
+      <w:b/>
+      <w:bCs/>
+    </w:rPr>
+  </w:style>
+  <w:style w:type="paragraph" w:styleId="Titre">
+    <w:name w:val="Titre"/>
+    <w:basedOn w:val="Normal"/>
+    <w:next w:val="Corpsdetexte"/>
+    <w:qFormat/>
+    <w:pPr>
+      <w:keepNext w:val="true"/>
+      <w:spacing w:before="240" w:after="120"/>
+    </w:pPr>
+    <w:rPr>
+      <w:rFonts w:ascii="Liberation Sans" w:hAnsi="Liberation Sans" w:eastAsia="Microsoft YaHei" w:cs="Arial"/>
+      <w:sz w:val="28"/>
+      <w:szCs w:val="28"/>
+    </w:rPr>
+  </w:style>
+  <w:style w:type="paragraph" w:styleId="Corpsdetexte">
+    <w:name w:val="Body Text"/>
+    <w:basedOn w:val="Normal"/>
+    <w:pPr>
+      <w:spacing w:lineRule="auto" w:line="276" w:before="0" w:after="140"/>
+    </w:pPr>
+    <w:rPr/>
+  </w:style>
+  <w:style w:type="paragraph" w:styleId="Liste">
+    <w:name w:val="List"/>
+    <w:basedOn w:val="Corpsdetexte"/>
+    <w:pPr/>
+    <w:rPr>
+      <w:rFonts w:cs="Arial"/>
+    </w:rPr>
+  </w:style>
+  <w:style w:type="paragraph" w:styleId="Lgende">
+    <w:name w:val="Caption"/>
+    <w:basedOn w:val="Normal"/>
+    <w:qFormat/>
+    <w:pPr>
+      <w:suppressLineNumbers/>
+      <w:spacing w:before="120" w:after="120"/>
+    </w:pPr>
+    <w:rPr>
+      <w:rFonts w:cs="Arial"/>
+      <w:i/>
+      <w:iCs/>
+      <w:sz w:val="24"/>
+      <w:szCs w:val="24"/>
+    </w:rPr>
+  </w:style>
+  <w:style w:type="paragraph" w:styleId="Index">
+    <w:name w:val="Index"/>
+    <w:basedOn w:val="Normal"/>
+    <w:qFormat/>
+    <w:pPr>
+      <w:suppressLineNumbers/>
+    </w:pPr>
+    <w:rPr>
+      <w:rFonts w:cs="Arial"/>
+      <w:lang w:val="zxx" w:eastAsia="zxx" w:bidi="zxx"/>
+    </w:rPr>
+  </w:style>
+  <w:style w:type="numbering" w:styleId="NoList" w:default="1">
+    <w:name w:val="No List"/>
+    <w:uiPriority w:val="99"/>
+    <w:semiHidden/>
+    <w:unhideWhenUsed/>
+    <w:qFormat/>
   </w:style>
   <w:style w:type="table" w:default="1" w:styleId="TableauNormal">
     <w:name w:val="Normal Table"/>
@@ -836,7 +1167,6 @@
     <w:semiHidden/>
     <w:unhideWhenUsed/>
     <w:tblPr>
-      <w:tblInd w:w="0" w:type="dxa"/>
       <w:tblCellMar>
         <w:top w:w="0" w:type="dxa"/>
         <w:left w:w="108" w:type="dxa"/>
@@ -844,12 +1174,6 @@
         <w:right w:w="108" w:type="dxa"/>
       </w:tblCellMar>
     </w:tblPr>
-  </w:style>
-  <w:style w:type="numbering" w:default="1" w:styleId="Aucuneliste">
-    <w:name w:val="No List"/>
-    <w:uiPriority w:val="99"/>
-    <w:semiHidden/>
-    <w:unhideWhenUsed/>
   </w:style>
 </w:styles>
 </file>

</xml_diff>